<commit_message>
Clarify mixed licensing and finalize report
</commit_message>
<xml_diff>
--- a/docs/FAEP-Multi_技术报告_修订版.docx
+++ b/docs/FAEP-Multi_技术报告_修订版.docx
@@ -194,7 +194,7 @@
           <w:color w:val="595959"/>
           <w:sz w:val="22"/>
         </w:rPr>
-        <w:t>2026 年 10 月 23 日</w:t>
+        <w:t>2026 年 10 月 27 日</w:t>
       </w:r>
     </w:p>
     <w:p>
@@ -1278,7 +1278,7 @@
           <w:rFonts w:ascii="宋体" w:hAnsi="宋体" w:eastAsia="宋体"/>
           <w:sz w:val="21"/>
         </w:rPr>
-        <w:t>FAEP 采用 GPL-3.0。LKH 是 FAEP 随附的独立第三方组件，适用其原始许可条款；本项目不对LKH 重新授权，也不把它纳入 GPL-3.0 的授权范围。公开仓库需要保留上游版权声明、完整第三方清单和 LKH 的原始说明。这一点在提交前还要按仓库实际打包方式再核对一次。</w:t>
+        <w:t>FAEP 衍生代码和团队新增代码采用 GPL-3.0。LKH 是 FAEP 随附的独立第三方组件，作者公开说明其用于研究并保留全部权利，第三方发行说明普遍将其解释为学术、非商业使用。LKH 被链接进探索节点，因此当前公开版本仅面向比赛和研究；商业使用前必须取得作者授权或替换求解器。LKH 不纳入本项目的 GPL-3.0 授权范围。</w:t>
       </w:r>
     </w:p>
     <w:p>
@@ -6282,7 +6282,7 @@
           <w:rFonts w:ascii="宋体" w:hAnsi="宋体" w:eastAsia="宋体"/>
           <w:sz w:val="21"/>
         </w:rPr>
-        <w:t>FAEP 采用 GPL-3.0，本项目保留其版权声明和修改说明。LKH 是独立第三方组件，适用其原始许可条款；本项目不将其重新授权为 GPL-3.0。提交前需要按公开仓库的实际打包方式核对LKH 和 Delaunay 代码的再分发条件，保留原始声明，必要时改为外部依赖。</w:t>
+        <w:t>FAEP 衍生代码和团队新增代码采用 GPL-3.0，并保留上游版权声明和修改说明。LKH 是独立第三方研究组件，作者保留全部权利；当前仓库采用混合许可，不能表述为纯 GPL-3.0。Delaunay 代码保留 RMIT 署名和原始声明，项目不将这些第三方代码重新授权。</w:t>
       </w:r>
     </w:p>
     <w:p>

</xml_diff>